<commit_message>
edit template for md/only posts working
</commit_message>
<xml_diff>
--- a/samples/crockett.docx
+++ b/samples/crockett.docx
@@ -89,38 +89,34 @@
       </w:r>
       <w:bookmarkEnd w:id="12"/>
     </w:p>
-    <w:bookmarkStart w:id="64" w:name="jcrt-journal"/>
+    <w:p>
+      <w:pPr>
+        <w:pStyle w:val="BodyText"/>
+      </w:pPr>
+      <w:r>
+        <w:t xml:space="preserve">The Journal for Cultural and Religious Theory (JCRT)</w:t>
+      </w:r>
+    </w:p>
+    <w:p>
+      <w:pPr>
+        <w:pStyle w:val="BodyText"/>
+      </w:pPr>
+      <w:r>
+        <w:t xml:space="preserve">1.1 | winter</w:t>
+      </w:r>
+    </w:p>
+    <w:bookmarkStart w:id="60" w:name="jcrt-article-title"/>
     <w:p>
       <w:pPr>
         <w:pStyle w:val="Heading1"/>
       </w:pPr>
       <w:r>
-        <w:t xml:space="preserve">The Journal for Cultural and Religious Theory (JCRT)</w:t>
-      </w:r>
-    </w:p>
-    <w:bookmarkStart w:id="13" w:name="jcrt-issue"/>
-    <w:p>
-      <w:pPr>
-        <w:pStyle w:val="Heading2"/>
-      </w:pPr>
-      <w:r>
-        <w:t xml:space="preserve">1.1 | winter</w:t>
-      </w:r>
-    </w:p>
-    <w:bookmarkEnd w:id="13"/>
-    <w:bookmarkStart w:id="17" w:name="jcrt-article-title"/>
-    <w:p>
-      <w:pPr>
-        <w:pStyle w:val="Heading2"/>
-      </w:pPr>
-      <w:r>
         <w:t xml:space="preserve">Anxiety and the S(Ub)Lime Body of God</w:t>
       </w:r>
     </w:p>
-    <w:bookmarkStart w:id="16" w:name="jcrt-author"/>
-    <w:p>
-      <w:pPr>
-        <w:pStyle w:val="Heading3"/>
+    <w:p>
+      <w:pPr>
+        <w:pStyle w:val="FirstParagraph"/>
       </w:pPr>
       <w:r>
         <w:t xml:space="preserve">Clayton Crockett</w:t>
@@ -128,7 +124,7 @@
     </w:p>
     <w:p>
       <w:pPr>
-        <w:pStyle w:val="FirstParagraph"/>
+        <w:pStyle w:val="BodyText"/>
       </w:pPr>
       <w:r>
         <w:rPr>
@@ -142,7 +138,7 @@
       <w:pPr>
         <w:pStyle w:val="BodyText"/>
       </w:pPr>
-      <w:hyperlink r:id="rId14">
+      <w:hyperlink r:id="rId13">
         <w:r>
           <w:rPr>
             <w:rStyle w:val="Hyperlink"/>
@@ -171,7 +167,7 @@
       <w:r>
         <w:t xml:space="preserve">Copyright 1999 Clayton Crockett. Published by Whitestone Publications. ISSN 1530-5228. Licensed under </w:t>
       </w:r>
-      <w:hyperlink r:id="rId15">
+      <w:hyperlink r:id="rId14">
         <w:r>
           <w:rPr>
             <w:rStyle w:val="Hyperlink"/>
@@ -196,20 +192,9 @@
         <w:t xml:space="preserve">Crockett - Anxiety and the S(ub)lime Body of God - JCRT 1.1</w:t>
       </w:r>
     </w:p>
-    <w:bookmarkEnd w:id="16"/>
-    <w:bookmarkEnd w:id="17"/>
-    <w:bookmarkStart w:id="18" w:name="anxiety-and-the-sublime-body-of-god"/>
-    <w:p>
-      <w:pPr>
-        <w:pStyle w:val="Heading2"/>
-      </w:pPr>
-      <w:r>
-        <w:t xml:space="preserve">Anxiety and the S(ub)lime Body of God</w:t>
-      </w:r>
-    </w:p>
-    <w:p>
-      <w:pPr>
-        <w:pStyle w:val="FirstParagraph"/>
+    <w:p>
+      <w:pPr>
+        <w:pStyle w:val="BodyText"/>
       </w:pPr>
       <w:r>
         <w:t xml:space="preserve">Clayton Crockett</w:t>
@@ -224,13 +209,7 @@
         <w:t xml:space="preserve"> </w:t>
       </w:r>
       <w:r>
-        <w:t xml:space="preserve">Anxiety and the S(ub)lime Body of God</w:t>
-      </w:r>
-      <w:r>
-        <w:t xml:space="preserve"> </w:t>
-      </w:r>
-      <w:r>
-        <w:t xml:space="preserve">=====================================</w:t>
+        <w:t xml:space="preserve">## Anxiety and the S(ub)lime Body of God</w:t>
       </w:r>
     </w:p>
     <w:p>
@@ -289,8 +268,7 @@
         </w:pict>
       </w:r>
     </w:p>
-    <w:bookmarkEnd w:id="18"/>
-    <w:bookmarkStart w:id="29" w:name="the-jouissance-of-the-other"/>
+    <w:bookmarkStart w:id="25" w:name="the-jouissance-of-the-other"/>
     <w:p>
       <w:pPr>
         <w:pStyle w:val="Heading2"/>
@@ -326,7 +304,7 @@
         <w:rPr>
           <w:rStyle w:val="FootnoteReference"/>
         </w:rPr>
-        <w:footnoteReference w:id="19"/>
+        <w:footnoteReference w:id="15"/>
       </w:r>
       <w:r>
         <w:t xml:space="preserve">  The Other (</w:t>
@@ -387,7 +365,7 @@
         <w:rPr>
           <w:rStyle w:val="FootnoteReference"/>
         </w:rPr>
-        <w:footnoteReference w:id="20"/>
+        <w:footnoteReference w:id="16"/>
       </w:r>
       <w:r>
         <w:t xml:space="preserve"> Furthermore,</w:t>
@@ -402,7 +380,7 @@
         <w:rPr>
           <w:rStyle w:val="FootnoteReference"/>
         </w:rPr>
-        <w:footnoteReference w:id="21"/>
+        <w:footnoteReference w:id="17"/>
       </w:r>
       <w:r>
         <w:t xml:space="preserve"> The universal Other is the basis of the particular, but the universal is never directly or immediately intuited, only the particular other object. The Other is the universal or transcendental ideal encountered both in and beyond every particular other, which Lacan calls a </w:t>
@@ -519,7 +497,7 @@
         <w:rPr>
           <w:rStyle w:val="FootnoteReference"/>
         </w:rPr>
-        <w:footnoteReference w:id="22"/>
+        <w:footnoteReference w:id="18"/>
       </w:r>
       <w:r>
         <w:t xml:space="preserve"> So jouissance is certainly sexual or libidinal in nature, but it is also destructive and ultimately self-destructive passion. This extremity of desire in its destructive capacity evokes horror, because it is unwilling to compromise or negotiate its drive for satisfaction. Socialized humans react with terror or disgust to an eruption of pure enjoyment, which is precisely the unleashing of absolute desire without any constraint or law. Lacan also characterizes </w:t>
@@ -566,7 +544,7 @@
         <w:rPr>
           <w:rStyle w:val="FootnoteReference"/>
         </w:rPr>
-        <w:footnoteReference w:id="23"/>
+        <w:footnoteReference w:id="19"/>
       </w:r>
       <w:r>
         <w:t xml:space="preserve"> A need refers to an animal need, a purely instinctual affair which has no relation to language, symbolic substitution, or speech, while a drive does possess such a social relation. The relationship between drive and desire is more complicated, but a drive is relatively more immediate, and closer to a need, whereas desire is more explicitly related to language. In some ways, one can understand this distinction between drive and desire along the lines of Freud’s distinction in his essay</w:t>
@@ -607,7 +585,7 @@
         <w:rPr>
           <w:rStyle w:val="FootnoteReference"/>
         </w:rPr>
-        <w:footnoteReference w:id="24"/>
+        <w:footnoteReference w:id="20"/>
       </w:r>
       <w:r>
         <w:t xml:space="preserve"> This means that </w:t>
@@ -767,7 +745,7 @@
         <w:rPr>
           <w:rStyle w:val="FootnoteReference"/>
         </w:rPr>
-        <w:footnoteReference w:id="25"/>
+        <w:footnoteReference w:id="21"/>
       </w:r>
       <w:r>
         <w:t xml:space="preserve"> According to Bergeron, the Alien is a xenomorph, or a radically unfamiliar form which signifies the absence of a father, or any meaningful symbolic order, and therefore the imaginary confrontation with</w:t>
@@ -782,7 +760,7 @@
         <w:rPr>
           <w:rStyle w:val="FootnoteReference"/>
         </w:rPr>
-        <w:footnoteReference w:id="26"/>
+        <w:footnoteReference w:id="22"/>
       </w:r>
       <w:r>
         <w:t xml:space="preserve"> A psychotic is a person who has been completely delivered up to the </w:t>
@@ -817,7 +795,7 @@
         <w:rPr>
           <w:rStyle w:val="FootnoteReference"/>
         </w:rPr>
-        <w:footnoteReference w:id="27"/>
+        <w:footnoteReference w:id="23"/>
       </w:r>
       <w:r>
         <w:t xml:space="preserve"> In the case of </w:t>
@@ -854,7 +832,7 @@
         <w:rPr>
           <w:rStyle w:val="FootnoteReference"/>
         </w:rPr>
-        <w:footnoteReference w:id="28"/>
+        <w:footnoteReference w:id="24"/>
       </w:r>
     </w:p>
     <w:p>
@@ -869,8 +847,8 @@
         <w:t xml:space="preserve">The Other is usually feminized in its representation, to demonstrate the absence of a father, that is, a signifying relation. For Lacan, psychosis is a disavowal of the Name of the Father, and the acceptance of the Name or Law of the Father is what ensures passage into social discourse and signification. In Bergeron’s essay, the Other is nearly equated with the real, or the Thing, beyond all symbolic relation, but it is important to remember that this representation of the limit of representation and of the real takes place within symbolic discourse and signification.</w:t>
       </w:r>
     </w:p>
-    <w:bookmarkEnd w:id="29"/>
-    <w:bookmarkStart w:id="34" w:name="the-slimy-subject"/>
+    <w:bookmarkEnd w:id="25"/>
+    <w:bookmarkStart w:id="30" w:name="the-slimy-subject"/>
     <w:p>
       <w:pPr>
         <w:pStyle w:val="Heading2"/>
@@ -909,7 +887,7 @@
         <w:rPr>
           <w:rStyle w:val="FootnoteReference"/>
         </w:rPr>
-        <w:footnoteReference w:id="30"/>
+        <w:footnoteReference w:id="26"/>
       </w:r>
       <w:r>
         <w:t xml:space="preserve"> This means that we are all inhabited by the Other, whether we want to disavow the horror of that insight or not.</w:t>
@@ -995,7 +973,7 @@
         <w:rPr>
           <w:rStyle w:val="FootnoteReference"/>
         </w:rPr>
-        <w:footnoteReference w:id="31"/>
+        <w:footnoteReference w:id="27"/>
       </w:r>
       <w:r>
         <w:t xml:space="preserve"> In other words, the condition of the emergence of subjectivity involves the rejection of a formless slime which (re)emerges elsewhere as matter. This slimy substance, which was intimate to the embodied human, then exerts a powerful horror but also fascination on him or her. In addition, the emergent and victorious </w:t>
@@ -1052,7 +1030,7 @@
         <w:rPr>
           <w:rStyle w:val="FootnoteReference"/>
         </w:rPr>
-        <w:footnoteReference w:id="32"/>
+        <w:footnoteReference w:id="28"/>
       </w:r>
       <w:r>
         <w:t xml:space="preserve"> In other words, subjectivity is constituted in the process of sloughing off one’s body, which is perceived as slime, and this externalized body encountered as substance provokes horror and sublimity.</w:t>
@@ -1104,7 +1082,7 @@
         <w:rPr>
           <w:rStyle w:val="FootnoteReference"/>
         </w:rPr>
-        <w:footnoteReference w:id="33"/>
+        <w:footnoteReference w:id="29"/>
       </w:r>
     </w:p>
     <w:p>
@@ -1128,8 +1106,8 @@
         <w:t xml:space="preserve"> of the Other in an uncanny way after the rejection of the body as other. One experiences not simply the determinate form of the human being, but body as body, body as pure substance and absolute formlessness.</w:t>
       </w:r>
     </w:p>
-    <w:bookmarkEnd w:id="34"/>
-    <w:bookmarkStart w:id="47" w:name="freuds-anxiety-and-gods-body"/>
+    <w:bookmarkEnd w:id="30"/>
+    <w:bookmarkStart w:id="43" w:name="freuds-anxiety-and-gods-body"/>
     <w:p>
       <w:pPr>
         <w:pStyle w:val="Heading2"/>
@@ -1191,143 +1169,143 @@
         <w:rPr>
           <w:rStyle w:val="FootnoteReference"/>
         </w:rPr>
+        <w:footnoteReference w:id="31"/>
+      </w:r>
+      <w:r>
+        <w:t xml:space="preserve">  This anticathexis prevents an unconscious idea from becoming preconscious or conscious, and this process of repression generates</w:t>
+      </w:r>
+      <w:r>
+        <w:t xml:space="preserve"> </w:t>
+      </w:r>
+      <w:r>
+        <w:t xml:space="preserve">“anxiety-hysteria,”</w:t>
+      </w:r>
+      <w:r>
+        <w:t xml:space="preserve"> </w:t>
+      </w:r>
+      <w:r>
+        <w:t xml:space="preserve">in which anxiety appears</w:t>
+      </w:r>
+      <w:r>
+        <w:t xml:space="preserve"> </w:t>
+      </w:r>
+      <w:r>
+        <w:t xml:space="preserve">“without the subject knowing what he is afraid of.”</w:t>
+      </w:r>
+      <w:r>
+        <w:rPr>
+          <w:rStyle w:val="FootnoteReference"/>
+        </w:rPr>
+        <w:footnoteReference w:id="32"/>
+      </w:r>
+      <w:r>
+        <w:t xml:space="preserve">    In 1928, however, he states that he</w:t>
+      </w:r>
+      <w:r>
+        <w:t xml:space="preserve"> </w:t>
+      </w:r>
+      <w:r>
+        <w:t xml:space="preserve">“can no longer maintain this view.”</w:t>
+      </w:r>
+      <w:r>
+        <w:t xml:space="preserve"> </w:t>
+      </w:r>
+      <w:r>
+        <w:t xml:space="preserve">Rather,</w:t>
+      </w:r>
+      <w:r>
+        <w:t xml:space="preserve"> </w:t>
+      </w:r>
+      <w:r>
+        <w:t xml:space="preserve">“it was anxiety which produced repression”</w:t>
+      </w:r>
+      <w:r>
+        <w:t xml:space="preserve"> </w:t>
+      </w:r>
+      <w:r>
+        <w:t xml:space="preserve">and not the other way around.</w:t>
+      </w:r>
+      <w:r>
+        <w:rPr>
+          <w:rStyle w:val="FootnoteReference"/>
+        </w:rPr>
+        <w:footnoteReference w:id="33"/>
+      </w:r>
+      <w:r>
+        <w:t xml:space="preserve">  This shift in the understanding of anxiety takes place in the context of two important developments of Freud’s later years. The first consists of an emphasis on a more literal explanation of castration, which is elaborated in essays such as</w:t>
+      </w:r>
+      <w:r>
+        <w:t xml:space="preserve"> </w:t>
+      </w:r>
+      <w:r>
+        <w:t xml:space="preserve">“The Infantile Genital Organization”</w:t>
+      </w:r>
+      <w:r>
+        <w:t xml:space="preserve"> </w:t>
+      </w:r>
+      <w:r>
+        <w:t xml:space="preserve">and</w:t>
+      </w:r>
+      <w:r>
+        <w:t xml:space="preserve"> </w:t>
+      </w:r>
+      <w:r>
+        <w:t xml:space="preserve">“Anatomical Sex-Distinction.”</w:t>
+      </w:r>
+      <w:r>
+        <w:t xml:space="preserve"> </w:t>
+      </w:r>
+      <w:r>
+        <w:t xml:space="preserve">In these essays, the basic difference between boys and girls hinges on a girl’s lack of possession of a penis, which is experienced by the girl as a profound lack or wound. The little boy, on the other hand, not only compares his own penis to that of his father, and feels a sense of inferiority regarding size, but more importantly, a boy experiences tremendous anxiety when confronted with the absence of a penis in a girl or woman. The little boy reacts by denying or disavowing the reality he sees, because to admit that girls do not possess a penis is to admit the contingency of his own, and the possibility of losing it. The little girl, on the other hand, presumably knows exactly what she sees and exactly what she wants. Freud’s certainty here about female desire contrasts with his famous acknowledgment elsewhere that he cannot understand what (a) woman wants.</w:t>
+      </w:r>
+      <w:r>
+        <w:t xml:space="preserve"> </w:t>
+      </w:r>
+      <w:r>
+        <w:t xml:space="preserve">“A little girl behaves differently,”</w:t>
+      </w:r>
+      <w:r>
+        <w:t xml:space="preserve"> </w:t>
+      </w:r>
+      <w:r>
+        <w:t xml:space="preserve">Freud writes,</w:t>
+      </w:r>
+      <w:r>
+        <w:t xml:space="preserve"> </w:t>
+      </w:r>
+      <w:r>
+        <w:t xml:space="preserve">“She makes her judgment and her decision in a flash. She has seen it and knows that she is without it and wants to have it.”</w:t>
+      </w:r>
+      <w:r>
+        <w:rPr>
+          <w:rStyle w:val="FootnoteReference"/>
+        </w:rPr>
+        <w:footnoteReference w:id="34"/>
+      </w:r>
+      <w:r>
+        <w:t xml:space="preserve"> This anatomical sex-distinction underlies Freud’s conclusion in </w:t>
+      </w:r>
+      <w:r>
+        <w:rPr>
+          <w:i/>
+          <w:iCs/>
+        </w:rPr>
+        <w:t xml:space="preserve">Inhibitions, Symptoms and Anxiety</w:t>
+      </w:r>
+      <w:r>
+        <w:t xml:space="preserve"> that</w:t>
+      </w:r>
+      <w:r>
+        <w:t xml:space="preserve"> </w:t>
+      </w:r>
+      <w:r>
+        <w:t xml:space="preserve">“the anxiety felt in animal phobias is the ego’s fear of castration.”</w:t>
+      </w:r>
+      <w:r>
+        <w:rPr>
+          <w:rStyle w:val="FootnoteReference"/>
+        </w:rPr>
         <w:footnoteReference w:id="35"/>
-      </w:r>
-      <w:r>
-        <w:t xml:space="preserve">  This anticathexis prevents an unconscious idea from becoming preconscious or conscious, and this process of repression generates</w:t>
-      </w:r>
-      <w:r>
-        <w:t xml:space="preserve"> </w:t>
-      </w:r>
-      <w:r>
-        <w:t xml:space="preserve">“anxiety-hysteria,”</w:t>
-      </w:r>
-      <w:r>
-        <w:t xml:space="preserve"> </w:t>
-      </w:r>
-      <w:r>
-        <w:t xml:space="preserve">in which anxiety appears</w:t>
-      </w:r>
-      <w:r>
-        <w:t xml:space="preserve"> </w:t>
-      </w:r>
-      <w:r>
-        <w:t xml:space="preserve">“without the subject knowing what he is afraid of.”</w:t>
-      </w:r>
-      <w:r>
-        <w:rPr>
-          <w:rStyle w:val="FootnoteReference"/>
-        </w:rPr>
-        <w:footnoteReference w:id="36"/>
-      </w:r>
-      <w:r>
-        <w:t xml:space="preserve">    In 1928, however, he states that he</w:t>
-      </w:r>
-      <w:r>
-        <w:t xml:space="preserve"> </w:t>
-      </w:r>
-      <w:r>
-        <w:t xml:space="preserve">“can no longer maintain this view.”</w:t>
-      </w:r>
-      <w:r>
-        <w:t xml:space="preserve"> </w:t>
-      </w:r>
-      <w:r>
-        <w:t xml:space="preserve">Rather,</w:t>
-      </w:r>
-      <w:r>
-        <w:t xml:space="preserve"> </w:t>
-      </w:r>
-      <w:r>
-        <w:t xml:space="preserve">“it was anxiety which produced repression”</w:t>
-      </w:r>
-      <w:r>
-        <w:t xml:space="preserve"> </w:t>
-      </w:r>
-      <w:r>
-        <w:t xml:space="preserve">and not the other way around.</w:t>
-      </w:r>
-      <w:r>
-        <w:rPr>
-          <w:rStyle w:val="FootnoteReference"/>
-        </w:rPr>
-        <w:footnoteReference w:id="37"/>
-      </w:r>
-      <w:r>
-        <w:t xml:space="preserve">  This shift in the understanding of anxiety takes place in the context of two important developments of Freud’s later years. The first consists of an emphasis on a more literal explanation of castration, which is elaborated in essays such as</w:t>
-      </w:r>
-      <w:r>
-        <w:t xml:space="preserve"> </w:t>
-      </w:r>
-      <w:r>
-        <w:t xml:space="preserve">“The Infantile Genital Organization”</w:t>
-      </w:r>
-      <w:r>
-        <w:t xml:space="preserve"> </w:t>
-      </w:r>
-      <w:r>
-        <w:t xml:space="preserve">and</w:t>
-      </w:r>
-      <w:r>
-        <w:t xml:space="preserve"> </w:t>
-      </w:r>
-      <w:r>
-        <w:t xml:space="preserve">“Anatomical Sex-Distinction.”</w:t>
-      </w:r>
-      <w:r>
-        <w:t xml:space="preserve"> </w:t>
-      </w:r>
-      <w:r>
-        <w:t xml:space="preserve">In these essays, the basic difference between boys and girls hinges on a girl’s lack of possession of a penis, which is experienced by the girl as a profound lack or wound. The little boy, on the other hand, not only compares his own penis to that of his father, and feels a sense of inferiority regarding size, but more importantly, a boy experiences tremendous anxiety when confronted with the absence of a penis in a girl or woman. The little boy reacts by denying or disavowing the reality he sees, because to admit that girls do not possess a penis is to admit the contingency of his own, and the possibility of losing it. The little girl, on the other hand, presumably knows exactly what she sees and exactly what she wants. Freud’s certainty here about female desire contrasts with his famous acknowledgment elsewhere that he cannot understand what (a) woman wants.</w:t>
-      </w:r>
-      <w:r>
-        <w:t xml:space="preserve"> </w:t>
-      </w:r>
-      <w:r>
-        <w:t xml:space="preserve">“A little girl behaves differently,”</w:t>
-      </w:r>
-      <w:r>
-        <w:t xml:space="preserve"> </w:t>
-      </w:r>
-      <w:r>
-        <w:t xml:space="preserve">Freud writes,</w:t>
-      </w:r>
-      <w:r>
-        <w:t xml:space="preserve"> </w:t>
-      </w:r>
-      <w:r>
-        <w:t xml:space="preserve">“She makes her judgment and her decision in a flash. She has seen it and knows that she is without it and wants to have it.”</w:t>
-      </w:r>
-      <w:r>
-        <w:rPr>
-          <w:rStyle w:val="FootnoteReference"/>
-        </w:rPr>
-        <w:footnoteReference w:id="38"/>
-      </w:r>
-      <w:r>
-        <w:t xml:space="preserve"> This anatomical sex-distinction underlies Freud’s conclusion in </w:t>
-      </w:r>
-      <w:r>
-        <w:rPr>
-          <w:i/>
-          <w:iCs/>
-        </w:rPr>
-        <w:t xml:space="preserve">Inhibitions, Symptoms and Anxiety</w:t>
-      </w:r>
-      <w:r>
-        <w:t xml:space="preserve"> that</w:t>
-      </w:r>
-      <w:r>
-        <w:t xml:space="preserve"> </w:t>
-      </w:r>
-      <w:r>
-        <w:t xml:space="preserve">“the anxiety felt in animal phobias is the ego’s fear of castration.”</w:t>
-      </w:r>
-      <w:r>
-        <w:rPr>
-          <w:rStyle w:val="FootnoteReference"/>
-        </w:rPr>
-        <w:footnoteReference w:id="39"/>
       </w:r>
     </w:p>
     <w:p>
@@ -1355,7 +1333,7 @@
         <w:rPr>
           <w:rStyle w:val="FootnoteReference"/>
         </w:rPr>
-        <w:footnoteReference w:id="40"/>
+        <w:footnoteReference w:id="36"/>
       </w:r>
       <w:r>
         <w:t xml:space="preserve"> To focus on the ego, Lacan holds, is to obliterate the revolutionary power of the problematic Freud opens up.</w:t>
@@ -1376,7 +1354,7 @@
         <w:rPr>
           <w:rStyle w:val="FootnoteReference"/>
         </w:rPr>
-        <w:footnoteReference w:id="41"/>
+        <w:footnoteReference w:id="37"/>
       </w:r>
       <w:r>
         <w:t xml:space="preserve"> Freud transfers the value his Viennese culture placed on the virile penis to the formation of every human person, and he presupposes rather than locates the trauma of anxiety in the observation of the other sex’s genitals. </w:t>
@@ -1431,7 +1409,7 @@
         <w:rPr>
           <w:rStyle w:val="FootnoteReference"/>
         </w:rPr>
-        <w:footnoteReference w:id="42"/>
+        <w:footnoteReference w:id="38"/>
       </w:r>
       <w:r>
         <w:t xml:space="preserve"> Here I am reading Freud against Freud by taking up his later understanding of anxiety in which anxiety precedes and causes repression, rather than vice versa. At the same time, however, I am critical of the other two developments in Freud’s later thought that are connected with this transformed understanding of anxiety, the focus on the ego as protagonist and the adoption of an essentialistic masculine model of sexuality.</w:t>
@@ -1452,7 +1430,7 @@
         <w:rPr>
           <w:rStyle w:val="FootnoteReference"/>
         </w:rPr>
-        <w:footnoteReference w:id="43"/>
+        <w:footnoteReference w:id="39"/>
       </w:r>
       <w:r>
         <w:t xml:space="preserve"> And more importantly, how would such a transformation affect theology, however implicitly? What if theology were characterized as a discourse of repression or defense set in motion by an uncontrollable anxiety? Finally, what if theology were to understand how it is implicated in that anxiety by thinking the anxiety itself as God?</w:t>
@@ -1499,7 +1477,7 @@
         <w:rPr>
           <w:rStyle w:val="FootnoteReference"/>
         </w:rPr>
-        <w:footnoteReference w:id="44"/>
+        <w:footnoteReference w:id="40"/>
       </w:r>
       <w:r>
         <w:t xml:space="preserve"> Luther writes at length how</w:t>
@@ -1526,7 +1504,7 @@
         <w:rPr>
           <w:rStyle w:val="FootnoteReference"/>
         </w:rPr>
-        <w:footnoteReference w:id="45"/>
+        <w:footnoteReference w:id="41"/>
       </w:r>
       <w:r>
         <w:t xml:space="preserve"> On this reading of anxiety, one could understand Luther’s discourse as connected to a profound horror of the body of God understood as substance or </w:t>
@@ -1599,14 +1577,14 @@
         <w:rPr>
           <w:rStyle w:val="FootnoteReference"/>
         </w:rPr>
-        <w:footnoteReference w:id="46"/>
+        <w:footnoteReference w:id="42"/>
       </w:r>
       <w:r>
         <w:t xml:space="preserve"> For the heroes, it is essential to distinguish Data as an android from Picard as a living and passionate human, even though Data desires to become human. In fact, the desire to become human validates Data and makes his power over the Borg acceptible because it reaffirms cherished humanistic values. In some ways, the Borg can be understood as reflecting a modern and humanistic horror of a certain understanding of postmodernism.</w:t>
       </w:r>
     </w:p>
-    <w:bookmarkEnd w:id="47"/>
-    <w:bookmarkStart w:id="63" w:name="X3e658bafd040ce2f85e3853864644fb575c4237"/>
+    <w:bookmarkEnd w:id="43"/>
+    <w:bookmarkStart w:id="58" w:name="X3e658bafd040ce2f85e3853864644fb575c4237"/>
     <w:p>
       <w:pPr>
         <w:pStyle w:val="Heading2"/>
@@ -1680,7 +1658,7 @@
         <w:rPr>
           <w:rStyle w:val="FootnoteReference"/>
         </w:rPr>
-        <w:footnoteReference w:id="48"/>
+        <w:footnoteReference w:id="44"/>
       </w:r>
       <w:r>
         <w:t xml:space="preserve"> In other words, although the distinction between beauty and sublime in Kant and others is commonly seen in terms of a feminine beauty and a masculine sublime, Zizek argues that sexual difference is more primordially inscribed into the split of the sublime into mathematical and dynamical. Zizek continues by associating the mathematical sublime with the feminine, while the dynamical sublime is inherently masculine. He then relates Kant’s distinctions of the sublime back to the </w:t>
@@ -1711,7 +1689,7 @@
         <w:rPr>
           <w:rStyle w:val="FootnoteReference"/>
         </w:rPr>
-        <w:footnoteReference w:id="49"/>
+        <w:footnoteReference w:id="45"/>
       </w:r>
     </w:p>
     <w:p>
@@ -1785,7 +1763,7 @@
         <w:rPr>
           <w:rStyle w:val="FootnoteReference"/>
         </w:rPr>
-        <w:footnoteReference w:id="50"/>
+        <w:footnoteReference w:id="46"/>
       </w:r>
       <w:r>
         <w:t xml:space="preserve"> For Zizek,</w:t>
@@ -1839,7 +1817,7 @@
         <w:rPr>
           <w:rStyle w:val="FootnoteReference"/>
         </w:rPr>
-        <w:footnoteReference w:id="51"/>
+        <w:footnoteReference w:id="47"/>
       </w:r>
       <w:r>
         <w:t xml:space="preserve"> A Lacanian understanding of the masculine as the exception posits a limit which man is an exception to because he has passed beyond the limit. This cuts off the alternative possibilities as circumscribed by the limit, and privileges the one unique exception. In a more strictly theological sense, God is usually constituted not only as male but also according to this logic of exceptionality.</w:t>
@@ -1905,7 +1883,7 @@
         <w:rPr>
           <w:rStyle w:val="FootnoteReference"/>
         </w:rPr>
-        <w:footnoteReference w:id="52"/>
+        <w:footnoteReference w:id="48"/>
       </w:r>
       <w:r>
         <w:t xml:space="preserve"> On the other hand, Zizek affirms the priority of the mathematical, feminine sublime, or the</w:t>
@@ -1932,7 +1910,7 @@
         <w:rPr>
           <w:rStyle w:val="FootnoteReference"/>
         </w:rPr>
-        <w:footnoteReference w:id="53"/>
+        <w:footnoteReference w:id="49"/>
       </w:r>
       <w:r>
         <w:t xml:space="preserve"> Rather than settle the issue, however, I want to map Zizek’s dichotomy or polarity onto my reading of Freudian anxiety and its respective theological counterpart.</w:t>
@@ -2006,7 +1984,7 @@
         <w:rPr>
           <w:rStyle w:val="FootnoteReference"/>
         </w:rPr>
-        <w:footnoteReference w:id="54"/>
+        <w:footnoteReference w:id="50"/>
       </w:r>
     </w:p>
     <w:p>
@@ -2043,7 +2021,7 @@
         <w:rPr>
           <w:rStyle w:val="FootnoteReference"/>
         </w:rPr>
-        <w:footnoteReference w:id="55"/>
+        <w:footnoteReference w:id="51"/>
       </w:r>
       <w:r>
         <w:t xml:space="preserve"> The fixation on a beyond effectively limits access to the beyond and bars it, which prompts a further eruption of anxiety. Of what, then, does the alternate understanding of anxiety consist? Following the later Freud, and taking anxiety to be the source of repression, we could think about repression less in terms of its widespread negative connotations than in terms of a Nietzschean active forgetting.</w:t>
@@ -2069,7 +2047,7 @@
         <w:rPr>
           <w:rStyle w:val="FootnoteReference"/>
         </w:rPr>
-        <w:footnoteReference w:id="56"/>
+        <w:footnoteReference w:id="52"/>
       </w:r>
       <w:r>
         <w:t xml:space="preserve"> Any total memory or complete recall would be paralyzing, because one could not act affirmatively without</w:t>
@@ -2136,7 +2114,7 @@
         <w:rPr>
           <w:rStyle w:val="FootnoteReference"/>
         </w:rPr>
-        <w:footnoteReference w:id="57"/>
+        <w:footnoteReference w:id="53"/>
       </w:r>
       <w:r>
         <w:t xml:space="preserve"> It is that very process of selection, however, that distributes the other possibilities in the constitution of a beyond. Every selection is</w:t>
@@ -2190,7 +2168,7 @@
         <w:rPr>
           <w:rStyle w:val="FootnoteReference"/>
         </w:rPr>
-        <w:footnoteReference w:id="58"/>
+        <w:footnoteReference w:id="54"/>
       </w:r>
       <w:r>
         <w:t xml:space="preserve"> Such a task is impossible for the imagination under the strict pressure of reason’s demand, but that very tension allows for the appearance of beauty by means of the sublime. The limit traced out by the struggle between reason and imagination in their profound finitude produces the beyond of the limit, which is the thought of the supersensible.</w:t>
@@ -2199,7 +2177,7 @@
         <w:rPr>
           <w:rStyle w:val="FootnoteReference"/>
         </w:rPr>
-        <w:footnoteReference w:id="59"/>
+        <w:footnoteReference w:id="55"/>
       </w:r>
       <w:r>
         <w:t xml:space="preserve"> Similarly, in the First Critique, the</w:t>
@@ -2220,7 +2198,7 @@
         <w:rPr>
           <w:rStyle w:val="FootnoteReference"/>
         </w:rPr>
-        <w:footnoteReference w:id="60"/>
+        <w:footnoteReference w:id="56"/>
       </w:r>
     </w:p>
     <w:p>
@@ -2284,7 +2262,7 @@
         <w:rPr>
           <w:rStyle w:val="FootnoteReference"/>
         </w:rPr>
-        <w:footnoteReference w:id="61"/>
+        <w:footnoteReference w:id="57"/>
       </w:r>
       <w:r>
         <w:t xml:space="preserve"> In addition, both views (theology as anxiety, theology as repression) are necessary in order to think about theology and psychoanalysis at a general level. In fact and in practice, this distinction is extremely fluid, such that theology transforms itself from anxiety to repression and back again within any single work of theology. My wager, however, is that theological thinking is ultimately more creative when understood as repression in this specific sense rather than as anxiety. The task for such a theology is to write the body of God, but not as a theological limit to or of a God that lies unreachably transcendent and beyond. God is rather the limit, the beyond within the limit, that is, anxiety itself, and theology is productive/repressive with it.</w:t>
@@ -2297,18 +2275,18 @@
         </w:pict>
       </w:r>
     </w:p>
-    <w:bookmarkStart w:id="62" w:name="notes"/>
-    <w:p>
-      <w:pPr>
-        <w:pStyle w:val="Heading3"/>
+    <w:bookmarkEnd w:id="58"/>
+    <w:bookmarkStart w:id="59" w:name="notes"/>
+    <w:p>
+      <w:pPr>
+        <w:pStyle w:val="Heading2"/>
       </w:pPr>
       <w:r>
         <w:t xml:space="preserve">Notes</w:t>
       </w:r>
     </w:p>
-    <w:bookmarkEnd w:id="62"/>
-    <w:bookmarkEnd w:id="63"/>
-    <w:bookmarkEnd w:id="64"/>
+    <w:bookmarkEnd w:id="59"/>
+    <w:bookmarkEnd w:id="60"/>
     <w:sectPr>
       <w:footnotePr>
         <w:numRestart w:val="eachSect"/>
@@ -2338,6 +2316,112 @@
       </w:r>
     </w:p>
   </w:footnote>
+  <w:footnote w:id="15">
+    <w:p>
+      <w:pPr>
+        <w:pStyle w:val="FootnoteText"/>
+      </w:pPr>
+      <w:r>
+        <w:rPr>
+          <w:rStyle w:val="FootnoteReference"/>
+        </w:rPr>
+        <w:footnoteRef/>
+      </w:r>
+      <w:r>
+        <w:t xml:space="preserve"> </w:t>
+      </w:r>
+      <w:r>
+        <w:t xml:space="preserve">Jacques Lacan, </w:t>
+      </w:r>
+      <w:r>
+        <w:rPr>
+          <w:i/>
+          <w:iCs/>
+        </w:rPr>
+        <w:t xml:space="preserve">The Four Fundamental Concepts of Psycho-Analysis</w:t>
+      </w:r>
+      <w:r>
+        <w:t xml:space="preserve">, edited by Jacques-Alain Miller, translated by Alan Sheridan (New York: W.W. Norton, 1978), p.235.</w:t>
+      </w:r>
+    </w:p>
+  </w:footnote>
+  <w:footnote w:id="16">
+    <w:p>
+      <w:pPr>
+        <w:pStyle w:val="FootnoteText"/>
+      </w:pPr>
+      <w:r>
+        <w:rPr>
+          <w:rStyle w:val="FootnoteReference"/>
+        </w:rPr>
+        <w:footnoteRef/>
+      </w:r>
+      <w:r>
+        <w:t xml:space="preserve"> </w:t>
+      </w:r>
+      <w:r>
+        <w:t xml:space="preserve">Immanuel Kant, </w:t>
+      </w:r>
+      <w:r>
+        <w:rPr>
+          <w:i/>
+          <w:iCs/>
+        </w:rPr>
+        <w:t xml:space="preserve">Critique of Pure Reason</w:t>
+      </w:r>
+      <w:r>
+        <w:t xml:space="preserve">, translated by Norman Kemp Smith (New York: St. Martin’s Press, 1965), p.43. B2 in the German version.</w:t>
+      </w:r>
+    </w:p>
+  </w:footnote>
+  <w:footnote w:id="17">
+    <w:p>
+      <w:pPr>
+        <w:pStyle w:val="FootnoteText"/>
+      </w:pPr>
+      <w:r>
+        <w:rPr>
+          <w:rStyle w:val="FootnoteReference"/>
+        </w:rPr>
+        <w:footnoteRef/>
+      </w:r>
+      <w:r>
+        <w:t xml:space="preserve"> </w:t>
+      </w:r>
+      <w:r>
+        <w:t xml:space="preserve">Ibid., p.538 (A652/B680).</w:t>
+      </w:r>
+    </w:p>
+  </w:footnote>
+  <w:footnote w:id="18">
+    <w:p>
+      <w:pPr>
+        <w:pStyle w:val="FootnoteText"/>
+      </w:pPr>
+      <w:r>
+        <w:rPr>
+          <w:rStyle w:val="FootnoteReference"/>
+        </w:rPr>
+        <w:footnoteRef/>
+      </w:r>
+      <w:r>
+        <w:t xml:space="preserve"> </w:t>
+      </w:r>
+      <w:r>
+        <w:t xml:space="preserve">Jacques Lacan, </w:t>
+      </w:r>
+      <w:r>
+        <w:rPr>
+          <w:i/>
+          <w:iCs/>
+        </w:rPr>
+        <w:t xml:space="preserve">The Ethics of Psychoanalysis 1959-1960: The Seminar of Jacques Lacan Book VII</w:t>
+      </w:r>
+      <w:r>
+        <w:t xml:space="preserve">, edited by Jacques-Alain Miller, translated by Dennis Porter (New York: W.W. Norton, 1992), p.199.</w:t>
+      </w:r>
+    </w:p>
+  </w:footnote>
   <w:footnote w:id="19">
     <w:p>
       <w:pPr>
@@ -2353,17 +2437,7 @@
         <w:t xml:space="preserve"> </w:t>
       </w:r>
       <w:r>
-        <w:t xml:space="preserve">Jacques Lacan, </w:t>
-      </w:r>
-      <w:r>
-        <w:rPr>
-          <w:i/>
-          <w:iCs/>
-        </w:rPr>
-        <w:t xml:space="preserve">The Four Fundamental Concepts of Psycho-Analysis</w:t>
-      </w:r>
-      <w:r>
-        <w:t xml:space="preserve">, edited by Jacques-Alain Miller, translated by Alan Sheridan (New York: W.W. Norton, 1978), p.235.</w:t>
+        <w:t xml:space="preserve">Ibid., p.208.</w:t>
       </w:r>
     </w:p>
   </w:footnote>
@@ -2382,17 +2456,17 @@
         <w:t xml:space="preserve"> </w:t>
       </w:r>
       <w:r>
-        <w:t xml:space="preserve">Immanuel Kant, </w:t>
-      </w:r>
-      <w:r>
-        <w:rPr>
-          <w:i/>
-          <w:iCs/>
-        </w:rPr>
-        <w:t xml:space="preserve">Critique of Pure Reason</w:t>
-      </w:r>
-      <w:r>
-        <w:t xml:space="preserve">, translated by Norman Kemp Smith (New York: St. Martin’s Press, 1965), p.43. B2 in the German version.</w:t>
+        <w:t xml:space="preserve">Sigmund Freud, </w:t>
+      </w:r>
+      <w:r>
+        <w:rPr>
+          <w:i/>
+          <w:iCs/>
+        </w:rPr>
+        <w:t xml:space="preserve">General Psychological Theory</w:t>
+      </w:r>
+      <w:r>
+        <w:t xml:space="preserve">, edited by Phillip Rieff (New York: Macmillan, 1963), p.126.</w:t>
       </w:r>
     </w:p>
   </w:footnote>
@@ -2411,7 +2485,29 @@
         <w:t xml:space="preserve"> </w:t>
       </w:r>
       <w:r>
-        <w:t xml:space="preserve">Ibid., p.538 (A652/B680).</w:t>
+        <w:t xml:space="preserve">Danielle Bergeron,</w:t>
+      </w:r>
+      <w:r>
+        <w:t xml:space="preserve"> </w:t>
+      </w:r>
+      <w:r>
+        <w:t xml:space="preserve">“Aliens and the Psychotic Experience,”</w:t>
+      </w:r>
+      <w:r>
+        <w:t xml:space="preserve"> </w:t>
+      </w:r>
+      <w:r>
+        <w:t xml:space="preserve">in </w:t>
+      </w:r>
+      <w:r>
+        <w:rPr>
+          <w:i/>
+          <w:iCs/>
+        </w:rPr>
+        <w:t xml:space="preserve">Lacan, Politics, Aesthetics</w:t>
+      </w:r>
+      <w:r>
+        <w:t xml:space="preserve">, edited by Willy Apollon and Richard Feldstein (Albany: State University of New York Press, 1996), p.306.</w:t>
       </w:r>
     </w:p>
   </w:footnote>
@@ -2430,17 +2526,7 @@
         <w:t xml:space="preserve"> </w:t>
       </w:r>
       <w:r>
-        <w:t xml:space="preserve">Jacques Lacan, </w:t>
-      </w:r>
-      <w:r>
-        <w:rPr>
-          <w:i/>
-          <w:iCs/>
-        </w:rPr>
-        <w:t xml:space="preserve">The Ethics of Psychoanalysis 1959-1960: The Seminar of Jacques Lacan Book VII</w:t>
-      </w:r>
-      <w:r>
-        <w:t xml:space="preserve">, edited by Jacques-Alain Miller, translated by Dennis Porter (New York: W.W. Norton, 1992), p.199.</w:t>
+        <w:t xml:space="preserve">Ibid., p.307.</w:t>
       </w:r>
     </w:p>
   </w:footnote>
@@ -2459,7 +2545,7 @@
         <w:t xml:space="preserve"> </w:t>
       </w:r>
       <w:r>
-        <w:t xml:space="preserve">Ibid., p.208.</w:t>
+        <w:t xml:space="preserve">Ibid., p.312.</w:t>
       </w:r>
     </w:p>
   </w:footnote>
@@ -2478,58 +2564,7 @@
         <w:t xml:space="preserve"> </w:t>
       </w:r>
       <w:r>
-        <w:t xml:space="preserve">Sigmund Freud, </w:t>
-      </w:r>
-      <w:r>
-        <w:rPr>
-          <w:i/>
-          <w:iCs/>
-        </w:rPr>
-        <w:t xml:space="preserve">General Psychological Theory</w:t>
-      </w:r>
-      <w:r>
-        <w:t xml:space="preserve">, edited by Phillip Rieff (New York: Macmillan, 1963), p.126.</w:t>
-      </w:r>
-    </w:p>
-  </w:footnote>
-  <w:footnote w:id="25">
-    <w:p>
-      <w:pPr>
-        <w:pStyle w:val="FootnoteText"/>
-      </w:pPr>
-      <w:r>
-        <w:rPr>
-          <w:rStyle w:val="FootnoteReference"/>
-        </w:rPr>
-        <w:footnoteRef/>
-      </w:r>
-      <w:r>
-        <w:t xml:space="preserve"> </w:t>
-      </w:r>
-      <w:r>
-        <w:t xml:space="preserve">Danielle Bergeron,</w:t>
-      </w:r>
-      <w:r>
-        <w:t xml:space="preserve"> </w:t>
-      </w:r>
-      <w:r>
-        <w:t xml:space="preserve">“Aliens and the Psychotic Experience,”</w:t>
-      </w:r>
-      <w:r>
-        <w:t xml:space="preserve"> </w:t>
-      </w:r>
-      <w:r>
-        <w:t xml:space="preserve">in </w:t>
-      </w:r>
-      <w:r>
-        <w:rPr>
-          <w:i/>
-          <w:iCs/>
-        </w:rPr>
-        <w:t xml:space="preserve">Lacan, Politics, Aesthetics</w:t>
-      </w:r>
-      <w:r>
-        <w:t xml:space="preserve">, edited by Willy Apollon and Richard Feldstein (Albany: State University of New York Press, 1996), p.306.</w:t>
+        <w:t xml:space="preserve">Ibid., p.312.</w:t>
       </w:r>
     </w:p>
   </w:footnote>
@@ -2548,7 +2583,29 @@
         <w:t xml:space="preserve"> </w:t>
       </w:r>
       <w:r>
-        <w:t xml:space="preserve">Ibid., p.307.</w:t>
+        <w:t xml:space="preserve">Julia Kristeva,</w:t>
+      </w:r>
+      <w:r>
+        <w:t xml:space="preserve"> </w:t>
+      </w:r>
+      <w:r>
+        <w:t xml:space="preserve">“The True-Real,”</w:t>
+      </w:r>
+      <w:r>
+        <w:t xml:space="preserve"> </w:t>
+      </w:r>
+      <w:r>
+        <w:t xml:space="preserve">in </w:t>
+      </w:r>
+      <w:r>
+        <w:rPr>
+          <w:i/>
+          <w:iCs/>
+        </w:rPr>
+        <w:t xml:space="preserve">The Kristeva Reader</w:t>
+      </w:r>
+      <w:r>
+        <w:t xml:space="preserve">, edited by Toril Moi (New York: Columbia University Press, 1986), p.218.</w:t>
       </w:r>
     </w:p>
   </w:footnote>
@@ -2567,7 +2624,17 @@
         <w:t xml:space="preserve"> </w:t>
       </w:r>
       <w:r>
-        <w:t xml:space="preserve">Ibid., p.312.</w:t>
+        <w:t xml:space="preserve">Slavoj Zizek, </w:t>
+      </w:r>
+      <w:r>
+        <w:rPr>
+          <w:i/>
+          <w:iCs/>
+        </w:rPr>
+        <w:t xml:space="preserve">Tarrying With the Negative: Kant, Hegel and the Critique of Ideology</w:t>
+      </w:r>
+      <w:r>
+        <w:t xml:space="preserve"> (Durham: Duke University Press, 1993), p.62.</w:t>
       </w:r>
     </w:p>
   </w:footnote>
@@ -2586,11 +2653,11 @@
         <w:t xml:space="preserve"> </w:t>
       </w:r>
       <w:r>
-        <w:t xml:space="preserve">Ibid., p.312.</w:t>
+        <w:t xml:space="preserve">Ibid., p.62.</w:t>
       </w:r>
     </w:p>
   </w:footnote>
-  <w:footnote w:id="30">
+  <w:footnote w:id="29">
     <w:p>
       <w:pPr>
         <w:pStyle w:val="FootnoteText"/>
@@ -2605,29 +2672,17 @@
         <w:t xml:space="preserve"> </w:t>
       </w:r>
       <w:r>
-        <w:t xml:space="preserve">Julia Kristeva,</w:t>
-      </w:r>
-      <w:r>
-        <w:t xml:space="preserve"> </w:t>
-      </w:r>
-      <w:r>
-        <w:t xml:space="preserve">“The True-Real,”</w:t>
-      </w:r>
-      <w:r>
-        <w:t xml:space="preserve"> </w:t>
-      </w:r>
-      <w:r>
-        <w:t xml:space="preserve">in </w:t>
-      </w:r>
-      <w:r>
-        <w:rPr>
-          <w:i/>
-          <w:iCs/>
-        </w:rPr>
-        <w:t xml:space="preserve">The Kristeva Reader</w:t>
-      </w:r>
-      <w:r>
-        <w:t xml:space="preserve">, edited by Toril Moi (New York: Columbia University Press, 1986), p.218.</w:t>
+        <w:t xml:space="preserve">Jacques Lacan, </w:t>
+      </w:r>
+      <w:r>
+        <w:rPr>
+          <w:i/>
+          <w:iCs/>
+        </w:rPr>
+        <w:t xml:space="preserve">The Seminar of Jacques Lacan: Book II The Ego in Freud’s Theory and in the Technique of Psychoanalysis</w:t>
+      </w:r>
+      <w:r>
+        <w:t xml:space="preserve">, edited by Jacques-Alain Miller, translated by Sylvana Tomaselli (New York:W.W. Norton, 1988), pp.154-55.</w:t>
       </w:r>
     </w:p>
   </w:footnote>
@@ -2646,17 +2701,17 @@
         <w:t xml:space="preserve"> </w:t>
       </w:r>
       <w:r>
-        <w:t xml:space="preserve">Slavoj Zizek, </w:t>
-      </w:r>
-      <w:r>
-        <w:rPr>
-          <w:i/>
-          <w:iCs/>
-        </w:rPr>
-        <w:t xml:space="preserve">Tarrying With the Negative: Kant, Hegel and the Critique of Ideology</w:t>
-      </w:r>
-      <w:r>
-        <w:t xml:space="preserve"> (Durham: Duke University Press, 1993), p.62.</w:t>
+        <w:t xml:space="preserve">Freud, </w:t>
+      </w:r>
+      <w:r>
+        <w:rPr>
+          <w:i/>
+          <w:iCs/>
+        </w:rPr>
+        <w:t xml:space="preserve">General Psychological Theory</w:t>
+      </w:r>
+      <w:r>
+        <w:t xml:space="preserve">, p.129.</w:t>
       </w:r>
     </w:p>
   </w:footnote>
@@ -2675,7 +2730,7 @@
         <w:t xml:space="preserve"> </w:t>
       </w:r>
       <w:r>
-        <w:t xml:space="preserve">Ibid., p.62.</w:t>
+        <w:t xml:space="preserve">Ibid., p.130.</w:t>
       </w:r>
     </w:p>
   </w:footnote>
@@ -2694,17 +2749,68 @@
         <w:t xml:space="preserve"> </w:t>
       </w:r>
       <w:r>
-        <w:t xml:space="preserve">Jacques Lacan, </w:t>
-      </w:r>
-      <w:r>
-        <w:rPr>
-          <w:i/>
-          <w:iCs/>
-        </w:rPr>
-        <w:t xml:space="preserve">The Seminar of Jacques Lacan: Book II The Ego in Freud’s Theory and in the Technique of Psychoanalysis</w:t>
-      </w:r>
-      <w:r>
-        <w:t xml:space="preserve">, edited by Jacques-Alain Miller, translated by Sylvana Tomaselli (New York:W.W. Norton, 1988), pp.154-55.</w:t>
+        <w:t xml:space="preserve">Sigmund Freud, </w:t>
+      </w:r>
+      <w:r>
+        <w:rPr>
+          <w:i/>
+          <w:iCs/>
+        </w:rPr>
+        <w:t xml:space="preserve">Inhibitions, Symptoms, and Anxiety</w:t>
+      </w:r>
+      <w:r>
+        <w:t xml:space="preserve">, in </w:t>
+      </w:r>
+      <w:r>
+        <w:rPr>
+          <w:i/>
+          <w:iCs/>
+        </w:rPr>
+        <w:t xml:space="preserve">The Standard Edition of the Complete Psychological Works of Sigmund Freud</w:t>
+      </w:r>
+      <w:r>
+        <w:t xml:space="preserve">, Volume XX, edited by James Strachey (London: The Hogarth Press, 1959), pp.108-9.</w:t>
+      </w:r>
+    </w:p>
+  </w:footnote>
+  <w:footnote w:id="34">
+    <w:p>
+      <w:pPr>
+        <w:pStyle w:val="FootnoteText"/>
+      </w:pPr>
+      <w:r>
+        <w:rPr>
+          <w:rStyle w:val="FootnoteReference"/>
+        </w:rPr>
+        <w:footnoteRef/>
+      </w:r>
+      <w:r>
+        <w:t xml:space="preserve"> </w:t>
+      </w:r>
+      <w:r>
+        <w:t xml:space="preserve">Sigmund Freud,</w:t>
+      </w:r>
+      <w:r>
+        <w:t xml:space="preserve"> </w:t>
+      </w:r>
+      <w:r>
+        <w:t xml:space="preserve">“Anatomical Sex-Distinction,”</w:t>
+      </w:r>
+      <w:r>
+        <w:t xml:space="preserve"> </w:t>
+      </w:r>
+      <w:r>
+        <w:t xml:space="preserve">in </w:t>
+      </w:r>
+      <w:r>
+        <w:rPr>
+          <w:i/>
+          <w:iCs/>
+        </w:rPr>
+        <w:t xml:space="preserve">The Standard Edition</w:t>
+      </w:r>
+      <w:r>
+        <w:t xml:space="preserve">, Volume XIX (1961), p.252.</w:t>
       </w:r>
     </w:p>
   </w:footnote>
@@ -2730,10 +2836,10 @@
           <w:i/>
           <w:iCs/>
         </w:rPr>
-        <w:t xml:space="preserve">General Psychological Theory</w:t>
-      </w:r>
-      <w:r>
-        <w:t xml:space="preserve">, p.129.</w:t>
+        <w:t xml:space="preserve">Inhibitions</w:t>
+      </w:r>
+      <w:r>
+        <w:t xml:space="preserve">, p.109.</w:t>
       </w:r>
     </w:p>
   </w:footnote>
@@ -2752,7 +2858,17 @@
         <w:t xml:space="preserve"> </w:t>
       </w:r>
       <w:r>
-        <w:t xml:space="preserve">Ibid., p.130.</w:t>
+        <w:t xml:space="preserve">Jacques Lacan, </w:t>
+      </w:r>
+      <w:r>
+        <w:rPr>
+          <w:i/>
+          <w:iCs/>
+        </w:rPr>
+        <w:t xml:space="preserve">The Ego in Freud’s Theory and in the Technique of Psychoanalysis</w:t>
+      </w:r>
+      <w:r>
+        <w:t xml:space="preserve">, p.321.</w:t>
       </w:r>
     </w:p>
   </w:footnote>
@@ -2771,27 +2887,27 @@
         <w:t xml:space="preserve"> </w:t>
       </w:r>
       <w:r>
-        <w:t xml:space="preserve">Sigmund Freud, </w:t>
-      </w:r>
-      <w:r>
-        <w:rPr>
-          <w:i/>
-          <w:iCs/>
-        </w:rPr>
-        <w:t xml:space="preserve">Inhibitions, Symptoms, and Anxiety</w:t>
-      </w:r>
-      <w:r>
-        <w:t xml:space="preserve">, in </w:t>
-      </w:r>
-      <w:r>
-        <w:rPr>
-          <w:i/>
-          <w:iCs/>
-        </w:rPr>
-        <w:t xml:space="preserve">The Standard Edition of the Complete Psychological Works of Sigmund Freud</w:t>
-      </w:r>
-      <w:r>
-        <w:t xml:space="preserve">, Volume XX, edited by James Strachey (London: The Hogarth Press, 1959), pp.108-9.</w:t>
+        <w:t xml:space="preserve">See Luce Irigaray, </w:t>
+      </w:r>
+      <w:r>
+        <w:rPr>
+          <w:i/>
+          <w:iCs/>
+        </w:rPr>
+        <w:t xml:space="preserve">Speculum of the Other Woman</w:t>
+      </w:r>
+      <w:r>
+        <w:t xml:space="preserve">, translated by Gillian C. Gill (Ithaca: Cornell University Press, 1985). For a profound analysis of the ways in which categories of sex and gender are constructed and wielded, and particularly their intersections with those of race and class, see Judith Butler, </w:t>
+      </w:r>
+      <w:r>
+        <w:rPr>
+          <w:i/>
+          <w:iCs/>
+        </w:rPr>
+        <w:t xml:space="preserve">Bodies That Matter </w:t>
+      </w:r>
+      <w:r>
+        <w:t xml:space="preserve">(New York: Routledge, 1993).</w:t>
       </w:r>
     </w:p>
   </w:footnote>
@@ -2810,29 +2926,17 @@
         <w:t xml:space="preserve"> </w:t>
       </w:r>
       <w:r>
-        <w:t xml:space="preserve">Sigmund Freud,</w:t>
-      </w:r>
-      <w:r>
-        <w:t xml:space="preserve"> </w:t>
-      </w:r>
-      <w:r>
-        <w:t xml:space="preserve">“Anatomical Sex-Distinction,”</w:t>
-      </w:r>
-      <w:r>
-        <w:t xml:space="preserve"> </w:t>
-      </w:r>
-      <w:r>
-        <w:t xml:space="preserve">in </w:t>
-      </w:r>
-      <w:r>
-        <w:rPr>
-          <w:i/>
-          <w:iCs/>
-        </w:rPr>
-        <w:t xml:space="preserve">The Standard Edition</w:t>
-      </w:r>
-      <w:r>
-        <w:t xml:space="preserve">, Volume XIX (1961), p.252.</w:t>
+        <w:t xml:space="preserve">Freud, </w:t>
+      </w:r>
+      <w:r>
+        <w:rPr>
+          <w:i/>
+          <w:iCs/>
+        </w:rPr>
+        <w:t xml:space="preserve">Inhibitions</w:t>
+      </w:r>
+      <w:r>
+        <w:t xml:space="preserve">, p.109.</w:t>
       </w:r>
     </w:p>
   </w:footnote>
@@ -2851,17 +2955,67 @@
         <w:t xml:space="preserve"> </w:t>
       </w:r>
       <w:r>
-        <w:t xml:space="preserve">Freud, </w:t>
-      </w:r>
-      <w:r>
-        <w:rPr>
-          <w:i/>
-          <w:iCs/>
-        </w:rPr>
-        <w:t xml:space="preserve">Inhibitions</w:t>
-      </w:r>
-      <w:r>
-        <w:t xml:space="preserve">, p.109.</w:t>
+        <w:t xml:space="preserve">Elizabeth J. Bellamy characterizes psychoanalysis as a discourse of anxiety rather than desire, an</w:t>
+      </w:r>
+      <w:r>
+        <w:t xml:space="preserve"> </w:t>
+      </w:r>
+      <w:r>
+        <w:t xml:space="preserve">“unlocatable eXcess of displacement,”</w:t>
+      </w:r>
+      <w:r>
+        <w:t xml:space="preserve"> </w:t>
+      </w:r>
+      <w:r>
+        <w:t xml:space="preserve">in her reading of </w:t>
+      </w:r>
+      <w:r>
+        <w:rPr>
+          <w:i/>
+          <w:iCs/>
+        </w:rPr>
+        <w:t xml:space="preserve">Othello </w:t>
+      </w:r>
+      <w:r>
+        <w:t xml:space="preserve">as a tale of epistemologically undecidable anxiety. Like the early Freud and most other psychoanalytic thinkers, however, she claims that</w:t>
+      </w:r>
+      <w:r>
+        <w:t xml:space="preserve"> </w:t>
+      </w:r>
+      <w:r>
+        <w:t xml:space="preserve">“anxiety is the (unreadable) </w:t>
+      </w:r>
+      <w:r>
+        <w:rPr>
+          <w:i/>
+          <w:iCs/>
+        </w:rPr>
+        <w:t xml:space="preserve">failure</w:t>
+      </w:r>
+      <w:r>
+        <w:t xml:space="preserve"> of repression.”</w:t>
+      </w:r>
+      <w:r>
+        <w:t xml:space="preserve"> </w:t>
+      </w:r>
+      <w:r>
+        <w:t xml:space="preserve">“Othello’s Lost Handkerchief: Where Psychoanalysis Finds Itself,”</w:t>
+      </w:r>
+      <w:r>
+        <w:t xml:space="preserve"> </w:t>
+      </w:r>
+      <w:r>
+        <w:t xml:space="preserve">in </w:t>
+      </w:r>
+      <w:r>
+        <w:rPr>
+          <w:i/>
+          <w:iCs/>
+        </w:rPr>
+        <w:t xml:space="preserve">Lacan, Politics, Aesthetics</w:t>
+      </w:r>
+      <w:r>
+        <w:t xml:space="preserve">, pp.151-79.</w:t>
       </w:r>
     </w:p>
   </w:footnote>
@@ -2880,17 +3034,17 @@
         <w:t xml:space="preserve"> </w:t>
       </w:r>
       <w:r>
-        <w:t xml:space="preserve">Jacques Lacan, </w:t>
-      </w:r>
-      <w:r>
-        <w:rPr>
-          <w:i/>
-          <w:iCs/>
-        </w:rPr>
-        <w:t xml:space="preserve">The Ego in Freud’s Theory and in the Technique of Psychoanalysis</w:t>
-      </w:r>
-      <w:r>
-        <w:t xml:space="preserve">, p.321.</w:t>
+        <w:t xml:space="preserve">Martin Luther, </w:t>
+      </w:r>
+      <w:r>
+        <w:rPr>
+          <w:i/>
+          <w:iCs/>
+        </w:rPr>
+        <w:t xml:space="preserve">The Freedom of a Christian</w:t>
+      </w:r>
+      <w:r>
+        <w:t xml:space="preserve">, translated by W.A. Lambert, in Three Treatises (Philadelphia: Fortress Press, 1970), p.281.</w:t>
       </w:r>
     </w:p>
   </w:footnote>
@@ -2909,27 +3063,14 @@
         <w:t xml:space="preserve"> </w:t>
       </w:r>
       <w:r>
-        <w:t xml:space="preserve">See Luce Irigaray, </w:t>
-      </w:r>
-      <w:r>
-        <w:rPr>
-          <w:i/>
-          <w:iCs/>
-        </w:rPr>
-        <w:t xml:space="preserve">Speculum of the Other Woman</w:t>
-      </w:r>
-      <w:r>
-        <w:t xml:space="preserve">, translated by Gillian C. Gill (Ithaca: Cornell University Press, 1985). For a profound analysis of the ways in which categories of sex and gender are constructed and wielded, and particularly their intersections with those of race and class, see Judith Butler, </w:t>
-      </w:r>
-      <w:r>
-        <w:rPr>
-          <w:i/>
-          <w:iCs/>
-        </w:rPr>
-        <w:t xml:space="preserve">Bodies That Matter </w:t>
-      </w:r>
-      <w:r>
-        <w:t xml:space="preserve">(New York: Routledge, 1993).</w:t>
+        <w:rPr>
+          <w:i/>
+          <w:iCs/>
+        </w:rPr>
+        <w:t xml:space="preserve"> What Luther Says: An Anthology</w:t>
+      </w:r>
+      <w:r>
+        <w:t xml:space="preserve">, compiled by Ewald M. Plass (St Louis: Concordia Publishing House, 1959), Volume I, p.336.</w:t>
       </w:r>
     </w:p>
   </w:footnote>
@@ -2948,96 +3089,29 @@
         <w:t xml:space="preserve"> </w:t>
       </w:r>
       <w:r>
-        <w:t xml:space="preserve">Freud, </w:t>
-      </w:r>
-      <w:r>
-        <w:rPr>
-          <w:i/>
-          <w:iCs/>
-        </w:rPr>
-        <w:t xml:space="preserve">Inhibitions</w:t>
-      </w:r>
-      <w:r>
-        <w:t xml:space="preserve">, p.109.</w:t>
-      </w:r>
-    </w:p>
-  </w:footnote>
-  <w:footnote w:id="43">
-    <w:p>
-      <w:pPr>
-        <w:pStyle w:val="FootnoteText"/>
-      </w:pPr>
-      <w:r>
-        <w:rPr>
-          <w:rStyle w:val="FootnoteReference"/>
-        </w:rPr>
-        <w:footnoteRef/>
-      </w:r>
-      <w:r>
-        <w:t xml:space="preserve"> </w:t>
-      </w:r>
-      <w:r>
-        <w:t xml:space="preserve">Elizabeth J. Bellamy characterizes psychoanalysis as a discourse of anxiety rather than desire, an</w:t>
-      </w:r>
-      <w:r>
-        <w:t xml:space="preserve"> </w:t>
-      </w:r>
-      <w:r>
-        <w:t xml:space="preserve">“unlocatable eXcess of displacement,”</w:t>
-      </w:r>
-      <w:r>
-        <w:t xml:space="preserve"> </w:t>
-      </w:r>
-      <w:r>
-        <w:t xml:space="preserve">in her reading of </w:t>
-      </w:r>
-      <w:r>
-        <w:rPr>
-          <w:i/>
-          <w:iCs/>
-        </w:rPr>
-        <w:t xml:space="preserve">Othello </w:t>
-      </w:r>
-      <w:r>
-        <w:t xml:space="preserve">as a tale of epistemologically undecidable anxiety. Like the early Freud and most other psychoanalytic thinkers, however, she claims that</w:t>
-      </w:r>
-      <w:r>
-        <w:t xml:space="preserve"> </w:t>
-      </w:r>
-      <w:r>
-        <w:t xml:space="preserve">“anxiety is the (unreadable) </w:t>
-      </w:r>
-      <w:r>
-        <w:rPr>
-          <w:i/>
-          <w:iCs/>
-        </w:rPr>
-        <w:t xml:space="preserve">failure</w:t>
-      </w:r>
-      <w:r>
-        <w:t xml:space="preserve"> of repression.”</w:t>
-      </w:r>
-      <w:r>
-        <w:t xml:space="preserve"> </w:t>
-      </w:r>
-      <w:r>
-        <w:t xml:space="preserve">“Othello’s Lost Handkerchief: Where Psychoanalysis Finds Itself,”</w:t>
-      </w:r>
-      <w:r>
-        <w:t xml:space="preserve"> </w:t>
-      </w:r>
-      <w:r>
-        <w:t xml:space="preserve">in </w:t>
-      </w:r>
-      <w:r>
-        <w:rPr>
-          <w:i/>
-          <w:iCs/>
-        </w:rPr>
-        <w:t xml:space="preserve">Lacan, Politics, Aesthetics</w:t>
-      </w:r>
-      <w:r>
-        <w:t xml:space="preserve">, pp.151-79.</w:t>
+        <w:t xml:space="preserve">See Donna Haraway,</w:t>
+      </w:r>
+      <w:r>
+        <w:t xml:space="preserve"> </w:t>
+      </w:r>
+      <w:r>
+        <w:t xml:space="preserve">“A Cyborg Manifesto: Science, Technology, and Socialist-Feminism in the Late Twentieth Century,”</w:t>
+      </w:r>
+      <w:r>
+        <w:t xml:space="preserve"> </w:t>
+      </w:r>
+      <w:r>
+        <w:t xml:space="preserve">in</w:t>
+      </w:r>
+      <w:r>
+        <w:rPr>
+          <w:i/>
+          <w:iCs/>
+        </w:rPr>
+        <w:t xml:space="preserve"> Simians, Cyborgs, and Women: The Reinvention of Nature</w:t>
+      </w:r>
+      <w:r>
+        <w:t xml:space="preserve"> (New York: Routledge, 1991), pp.149-81.</w:t>
       </w:r>
     </w:p>
   </w:footnote>
@@ -3056,17 +3130,17 @@
         <w:t xml:space="preserve"> </w:t>
       </w:r>
       <w:r>
-        <w:t xml:space="preserve">Martin Luther, </w:t>
-      </w:r>
-      <w:r>
-        <w:rPr>
-          <w:i/>
-          <w:iCs/>
-        </w:rPr>
-        <w:t xml:space="preserve">The Freedom of a Christian</w:t>
-      </w:r>
-      <w:r>
-        <w:t xml:space="preserve">, translated by W.A. Lambert, in Three Treatises (Philadelphia: Fortress Press, 1970), p.281.</w:t>
+        <w:t xml:space="preserve">Zizek, </w:t>
+      </w:r>
+      <w:r>
+        <w:rPr>
+          <w:i/>
+          <w:iCs/>
+        </w:rPr>
+        <w:t xml:space="preserve">Tarrying With the Negative</w:t>
+      </w:r>
+      <w:r>
+        <w:t xml:space="preserve">, p.53.</w:t>
       </w:r>
     </w:p>
   </w:footnote>
@@ -3085,14 +3159,17 @@
         <w:t xml:space="preserve"> </w:t>
       </w:r>
       <w:r>
-        <w:rPr>
-          <w:i/>
-          <w:iCs/>
-        </w:rPr>
-        <w:t xml:space="preserve"> What Luther Says: An Anthology</w:t>
-      </w:r>
-      <w:r>
-        <w:t xml:space="preserve">, compiled by Ewald M. Plass (St Louis: Concordia Publishing House, 1959), Volume I, p.336.</w:t>
+        <w:t xml:space="preserve">I am primarily dealing here with Zizek’s use of Lacan’s fomulas of sexuation. For Lacan’s presentation of this distinction, see Jacques Lacan, </w:t>
+      </w:r>
+      <w:r>
+        <w:rPr>
+          <w:i/>
+          <w:iCs/>
+        </w:rPr>
+        <w:t xml:space="preserve">On Feminine Sexuality The Limits of Love and Knowledge: The Seminar of Jacques Lacan Book XX Encore 1972-1973</w:t>
+      </w:r>
+      <w:r>
+        <w:t xml:space="preserve">, edited by Jacques-Alain Miller (New York: W.W. Norton, 1998), especially pp.64-81.</w:t>
       </w:r>
     </w:p>
   </w:footnote>
@@ -3111,29 +3188,48 @@
         <w:t xml:space="preserve"> </w:t>
       </w:r>
       <w:r>
-        <w:t xml:space="preserve">See Donna Haraway,</w:t>
-      </w:r>
-      <w:r>
-        <w:t xml:space="preserve"> </w:t>
-      </w:r>
-      <w:r>
-        <w:t xml:space="preserve">“A Cyborg Manifesto: Science, Technology, and Socialist-Feminism in the Late Twentieth Century,”</w:t>
-      </w:r>
-      <w:r>
-        <w:t xml:space="preserve"> </w:t>
-      </w:r>
-      <w:r>
-        <w:t xml:space="preserve">in</w:t>
-      </w:r>
-      <w:r>
-        <w:rPr>
-          <w:i/>
-          <w:iCs/>
-        </w:rPr>
-        <w:t xml:space="preserve"> Simians, Cyborgs, and Women: The Reinvention of Nature</w:t>
-      </w:r>
-      <w:r>
-        <w:t xml:space="preserve"> (New York: Routledge, 1991), pp.149-81.</w:t>
+        <w:t xml:space="preserve">Ibid., p.57.</w:t>
+      </w:r>
+    </w:p>
+  </w:footnote>
+  <w:footnote w:id="47">
+    <w:p>
+      <w:pPr>
+        <w:pStyle w:val="FootnoteText"/>
+      </w:pPr>
+      <w:r>
+        <w:rPr>
+          <w:rStyle w:val="FootnoteReference"/>
+        </w:rPr>
+        <w:footnoteRef/>
+      </w:r>
+      <w:r>
+        <w:t xml:space="preserve"> </w:t>
+      </w:r>
+      <w:r>
+        <w:t xml:space="preserve">This privileging of beyond over limit is the standard reading of speculative idealism, especially Fichte and Hegel, although Zizek conducts a very original, Kantian, and counter-intuitive reading of Hegel which claims that Hegel radicalizes the finitude Kant asserts rather than overcoming it. See </w:t>
+      </w:r>
+      <w:r>
+        <w:rPr>
+          <w:i/>
+          <w:iCs/>
+        </w:rPr>
+        <w:t xml:space="preserve">Tarrying With the Negative</w:t>
+      </w:r>
+      <w:r>
+        <w:t xml:space="preserve">, Chapter Three:</w:t>
+      </w:r>
+      <w:r>
+        <w:t xml:space="preserve"> </w:t>
+      </w:r>
+      <w:r>
+        <w:t xml:space="preserve">“Hegel’s Logic of Essence,”</w:t>
+      </w:r>
+      <w:r>
+        <w:t xml:space="preserve"> </w:t>
+      </w:r>
+      <w:r>
+        <w:t xml:space="preserve">pp.125-61.</w:t>
       </w:r>
     </w:p>
   </w:footnote>
@@ -3152,7 +3248,62 @@
         <w:t xml:space="preserve"> </w:t>
       </w:r>
       <w:r>
-        <w:t xml:space="preserve">Zizek, </w:t>
+        <w:t xml:space="preserve">As Zizek acknowledges, this interpretation posits that</w:t>
+      </w:r>
+      <w:r>
+        <w:t xml:space="preserve"> </w:t>
+      </w:r>
+      <w:r>
+        <w:t xml:space="preserve">“woman”</w:t>
+      </w:r>
+      <w:r>
+        <w:t xml:space="preserve"> </w:t>
+      </w:r>
+      <w:r>
+        <w:t xml:space="preserve">is nothing in herself, but only what she is for</w:t>
+      </w:r>
+      <w:r>
+        <w:t xml:space="preserve"> </w:t>
+      </w:r>
+      <w:r>
+        <w:t xml:space="preserve">“man’s”</w:t>
+      </w:r>
+      <w:r>
+        <w:t xml:space="preserve"> </w:t>
+      </w:r>
+      <w:r>
+        <w:t xml:space="preserve">enjoyment, or </w:t>
+      </w:r>
+      <w:r>
+        <w:rPr>
+          <w:i/>
+          <w:iCs/>
+        </w:rPr>
+        <w:t xml:space="preserve">jouissance</w:t>
+      </w:r>
+      <w:r>
+        <w:t xml:space="preserve">. Later in the book, however, Zizek conducts a Lacanian reversal of symptom and ground, which argues that contrary to the manifest reading,</w:t>
+      </w:r>
+      <w:r>
+        <w:t xml:space="preserve"> </w:t>
+      </w:r>
+      <w:r>
+        <w:t xml:space="preserve">“Man himself exists only through woman qua his symptom,”</w:t>
+      </w:r>
+      <w:r>
+        <w:t xml:space="preserve"> </w:t>
+      </w:r>
+      <w:r>
+        <w:t xml:space="preserve">he ex-sists outside himself, through woman, whereas woman, being not-all, does not ex-sist, but possesses an insistance which</w:t>
+      </w:r>
+      <w:r>
+        <w:t xml:space="preserve"> </w:t>
+      </w:r>
+      <w:r>
+        <w:t xml:space="preserve">“does not only come to be through man.”</w:t>
+      </w:r>
+      <w:r>
+        <w:t xml:space="preserve"> </w:t>
       </w:r>
       <w:r>
         <w:rPr>
@@ -3162,7 +3313,7 @@
         <w:t xml:space="preserve">Tarrying With the Negative</w:t>
       </w:r>
       <w:r>
-        <w:t xml:space="preserve">, p.53.</w:t>
+        <w:t xml:space="preserve">, p.188.</w:t>
       </w:r>
     </w:p>
   </w:footnote>
@@ -3181,17 +3332,17 @@
         <w:t xml:space="preserve"> </w:t>
       </w:r>
       <w:r>
-        <w:t xml:space="preserve">I am primarily dealing here with Zizek’s use of Lacan’s fomulas of sexuation. For Lacan’s presentation of this distinction, see Jacques Lacan, </w:t>
-      </w:r>
-      <w:r>
-        <w:rPr>
-          <w:i/>
-          <w:iCs/>
-        </w:rPr>
-        <w:t xml:space="preserve">On Feminine Sexuality The Limits of Love and Knowledge: The Seminar of Jacques Lacan Book XX Encore 1972-1973</w:t>
-      </w:r>
-      <w:r>
-        <w:t xml:space="preserve">, edited by Jacques-Alain Miller (New York: W.W. Norton, 1998), especially pp.64-81.</w:t>
+        <w:t xml:space="preserve">Lacan, </w:t>
+      </w:r>
+      <w:r>
+        <w:rPr>
+          <w:i/>
+          <w:iCs/>
+        </w:rPr>
+        <w:t xml:space="preserve">Seminar XX</w:t>
+      </w:r>
+      <w:r>
+        <w:t xml:space="preserve">, p.77.</w:t>
       </w:r>
     </w:p>
   </w:footnote>
@@ -3210,7 +3361,7 @@
         <w:t xml:space="preserve"> </w:t>
       </w:r>
       <w:r>
-        <w:t xml:space="preserve">Ibid., p.57.</w:t>
+        <w:t xml:space="preserve">Ibid., p.47.</w:t>
       </w:r>
     </w:p>
   </w:footnote>
@@ -3229,29 +3380,17 @@
         <w:t xml:space="preserve"> </w:t>
       </w:r>
       <w:r>
-        <w:t xml:space="preserve">This privileging of beyond over limit is the standard reading of speculative idealism, especially Fichte and Hegel, although Zizek conducts a very original, Kantian, and counter-intuitive reading of Hegel which claims that Hegel radicalizes the finitude Kant asserts rather than overcoming it. See </w:t>
-      </w:r>
-      <w:r>
-        <w:rPr>
-          <w:i/>
-          <w:iCs/>
-        </w:rPr>
-        <w:t xml:space="preserve">Tarrying With the Negative</w:t>
-      </w:r>
-      <w:r>
-        <w:t xml:space="preserve">, Chapter Three:</w:t>
-      </w:r>
-      <w:r>
-        <w:t xml:space="preserve"> </w:t>
-      </w:r>
-      <w:r>
-        <w:t xml:space="preserve">“Hegel’s Logic of Essence,”</w:t>
-      </w:r>
-      <w:r>
-        <w:t xml:space="preserve"> </w:t>
-      </w:r>
-      <w:r>
-        <w:t xml:space="preserve">pp.125-61.</w:t>
+        <w:t xml:space="preserve">Jean-Pierre Changeux, </w:t>
+      </w:r>
+      <w:r>
+        <w:rPr>
+          <w:i/>
+          <w:iCs/>
+        </w:rPr>
+        <w:t xml:space="preserve">Neuronal Man</w:t>
+      </w:r>
+      <w:r>
+        <w:t xml:space="preserve">, translated by Laurence Garey (Princeton: Princeton University Press, 1997), p.157.</w:t>
       </w:r>
     </w:p>
   </w:footnote>
@@ -3270,72 +3409,17 @@
         <w:t xml:space="preserve"> </w:t>
       </w:r>
       <w:r>
-        <w:t xml:space="preserve">As Zizek acknowledges, this interpretation posits that</w:t>
-      </w:r>
-      <w:r>
-        <w:t xml:space="preserve"> </w:t>
-      </w:r>
-      <w:r>
-        <w:t xml:space="preserve">“woman”</w:t>
-      </w:r>
-      <w:r>
-        <w:t xml:space="preserve"> </w:t>
-      </w:r>
-      <w:r>
-        <w:t xml:space="preserve">is nothing in herself, but only what she is for</w:t>
-      </w:r>
-      <w:r>
-        <w:t xml:space="preserve"> </w:t>
-      </w:r>
-      <w:r>
-        <w:t xml:space="preserve">“man’s”</w:t>
-      </w:r>
-      <w:r>
-        <w:t xml:space="preserve"> </w:t>
-      </w:r>
-      <w:r>
-        <w:t xml:space="preserve">enjoyment, or </w:t>
-      </w:r>
-      <w:r>
-        <w:rPr>
-          <w:i/>
-          <w:iCs/>
-        </w:rPr>
-        <w:t xml:space="preserve">jouissance</w:t>
-      </w:r>
-      <w:r>
-        <w:t xml:space="preserve">. Later in the book, however, Zizek conducts a Lacanian reversal of symptom and ground, which argues that contrary to the manifest reading,</w:t>
-      </w:r>
-      <w:r>
-        <w:t xml:space="preserve"> </w:t>
-      </w:r>
-      <w:r>
-        <w:t xml:space="preserve">“Man himself exists only through woman qua his symptom,”</w:t>
-      </w:r>
-      <w:r>
-        <w:t xml:space="preserve"> </w:t>
-      </w:r>
-      <w:r>
-        <w:t xml:space="preserve">he ex-sists outside himself, through woman, whereas woman, being not-all, does not ex-sist, but possesses an insistance which</w:t>
-      </w:r>
-      <w:r>
-        <w:t xml:space="preserve"> </w:t>
-      </w:r>
-      <w:r>
-        <w:t xml:space="preserve">“does not only come to be through man.”</w:t>
-      </w:r>
-      <w:r>
-        <w:t xml:space="preserve"> </w:t>
-      </w:r>
-      <w:r>
-        <w:rPr>
-          <w:i/>
-          <w:iCs/>
-        </w:rPr>
-        <w:t xml:space="preserve">Tarrying With the Negative</w:t>
-      </w:r>
-      <w:r>
-        <w:t xml:space="preserve">, p.188.</w:t>
+        <w:t xml:space="preserve">Friedrich Nietzsche, </w:t>
+      </w:r>
+      <w:r>
+        <w:rPr>
+          <w:i/>
+          <w:iCs/>
+        </w:rPr>
+        <w:t xml:space="preserve">On the Genealogy of Morals</w:t>
+      </w:r>
+      <w:r>
+        <w:t xml:space="preserve">, translated by Walter Kaufmann (New York: Random House, 1967), p.58.</w:t>
       </w:r>
     </w:p>
   </w:footnote>
@@ -3354,17 +3438,17 @@
         <w:t xml:space="preserve"> </w:t>
       </w:r>
       <w:r>
-        <w:t xml:space="preserve">Lacan, </w:t>
-      </w:r>
-      <w:r>
-        <w:rPr>
-          <w:i/>
-          <w:iCs/>
-        </w:rPr>
-        <w:t xml:space="preserve">Seminar XX</w:t>
-      </w:r>
-      <w:r>
-        <w:t xml:space="preserve">, p.77.</w:t>
+        <w:t xml:space="preserve">See Henri Bergson, </w:t>
+      </w:r>
+      <w:r>
+        <w:rPr>
+          <w:i/>
+          <w:iCs/>
+        </w:rPr>
+        <w:t xml:space="preserve">An Introduction to Metaphysics</w:t>
+      </w:r>
+      <w:r>
+        <w:t xml:space="preserve">, translated by T.E. Hulme (New York: Macmillan, 1955), pp.27-28.</w:t>
       </w:r>
     </w:p>
   </w:footnote>
@@ -3383,7 +3467,17 @@
         <w:t xml:space="preserve"> </w:t>
       </w:r>
       <w:r>
-        <w:t xml:space="preserve">Ibid., p.47.</w:t>
+        <w:t xml:space="preserve">Gilles Deleuze characterizes the relationship among the Kantian faculties as a discordant or contingent accord in </w:t>
+      </w:r>
+      <w:r>
+        <w:rPr>
+          <w:i/>
+          <w:iCs/>
+        </w:rPr>
+        <w:t xml:space="preserve">Kant’s Critical Philosophy</w:t>
+      </w:r>
+      <w:r>
+        <w:t xml:space="preserve">, translated by Hugh Tomlinson and Barbara Habberjam (Minneapolis: University of Minnesota Press, 1984), p.54.</w:t>
       </w:r>
     </w:p>
   </w:footnote>
@@ -3402,17 +3496,17 @@
         <w:t xml:space="preserve"> </w:t>
       </w:r>
       <w:r>
-        <w:t xml:space="preserve">Jean-Pierre Changeux, </w:t>
-      </w:r>
-      <w:r>
-        <w:rPr>
-          <w:i/>
-          <w:iCs/>
-        </w:rPr>
-        <w:t xml:space="preserve">Neuronal Man</w:t>
-      </w:r>
-      <w:r>
-        <w:t xml:space="preserve">, translated by Laurence Garey (Princeton: Princeton University Press, 1997), p.157.</w:t>
+        <w:t xml:space="preserve">On the relationship of imagination and reason in the mathematical sublime, see Immanuel Kant, </w:t>
+      </w:r>
+      <w:r>
+        <w:rPr>
+          <w:i/>
+          <w:iCs/>
+        </w:rPr>
+        <w:t xml:space="preserve">Critique of Judgment</w:t>
+      </w:r>
+      <w:r>
+        <w:t xml:space="preserve">, translated by Werner Pluhar (Indianapolis: Hackett Publishing Co., 1987), pp.109-116.</w:t>
       </w:r>
     </w:p>
   </w:footnote>
@@ -3431,183 +3525,67 @@
         <w:t xml:space="preserve"> </w:t>
       </w:r>
       <w:r>
-        <w:t xml:space="preserve">Friedrich Nietzsche, </w:t>
-      </w:r>
-      <w:r>
-        <w:rPr>
-          <w:i/>
-          <w:iCs/>
-        </w:rPr>
-        <w:t xml:space="preserve">On the Genealogy of Morals</w:t>
-      </w:r>
-      <w:r>
-        <w:t xml:space="preserve">, translated by Walter Kaufmann (New York: Random House, 1967), p.58.</w:t>
+        <w:t xml:space="preserve">The main distinction between Zizek and Lacan here is the notion of finitude, because Lacan in </w:t>
+      </w:r>
+      <w:r>
+        <w:rPr>
+          <w:i/>
+          <w:iCs/>
+        </w:rPr>
+        <w:t xml:space="preserve">Seminar XX</w:t>
+      </w:r>
+      <w:r>
+        <w:t xml:space="preserve"> relates the</w:t>
+      </w:r>
+      <w:r>
+        <w:t xml:space="preserve"> </w:t>
+      </w:r>
+      <w:r>
+        <w:t xml:space="preserve">“not-all”</w:t>
+      </w:r>
+      <w:r>
+        <w:t xml:space="preserve"> </w:t>
+      </w:r>
+      <w:r>
+        <w:t xml:space="preserve">to an infinite set in order for it to not function as an exception (p.103). Lacan deals with classical Aristotelian logic, where any negation would have to constitute an exception, and it is on the other hand modern forms of</w:t>
+      </w:r>
+      <w:r>
+        <w:t xml:space="preserve"> </w:t>
+      </w:r>
+      <w:r>
+        <w:t xml:space="preserve">“infinite”</w:t>
+      </w:r>
+      <w:r>
+        <w:t xml:space="preserve"> </w:t>
+      </w:r>
+      <w:r>
+        <w:t xml:space="preserve">mathematics and logic that allow a thinking of negation or</w:t>
+      </w:r>
+      <w:r>
+        <w:t xml:space="preserve"> </w:t>
+      </w:r>
+      <w:r>
+        <w:t xml:space="preserve">“not-all”</w:t>
+      </w:r>
+      <w:r>
+        <w:t xml:space="preserve"> </w:t>
+      </w:r>
+      <w:r>
+        <w:t xml:space="preserve">which would not fall into a logic of exceptionality. Here I am following Zizek by relating Lacan’s distinction to a </w:t>
+      </w:r>
+      <w:r>
+        <w:rPr>
+          <w:i/>
+          <w:iCs/>
+        </w:rPr>
+        <w:t xml:space="preserve">philosophical</w:t>
+      </w:r>
+      <w:r>
+        <w:t xml:space="preserve"> understanding of finitude as opposed to a metaphysical infinite which could only function as an exception to worldly finitude understood as simply the realm of human experience.</w:t>
       </w:r>
     </w:p>
   </w:footnote>
   <w:footnote w:id="57">
-    <w:p>
-      <w:pPr>
-        <w:pStyle w:val="FootnoteText"/>
-      </w:pPr>
-      <w:r>
-        <w:rPr>
-          <w:rStyle w:val="FootnoteReference"/>
-        </w:rPr>
-        <w:footnoteRef/>
-      </w:r>
-      <w:r>
-        <w:t xml:space="preserve"> </w:t>
-      </w:r>
-      <w:r>
-        <w:t xml:space="preserve">See Henri Bergson, </w:t>
-      </w:r>
-      <w:r>
-        <w:rPr>
-          <w:i/>
-          <w:iCs/>
-        </w:rPr>
-        <w:t xml:space="preserve">An Introduction to Metaphysics</w:t>
-      </w:r>
-      <w:r>
-        <w:t xml:space="preserve">, translated by T.E. Hulme (New York: Macmillan, 1955), pp.27-28.</w:t>
-      </w:r>
-    </w:p>
-  </w:footnote>
-  <w:footnote w:id="58">
-    <w:p>
-      <w:pPr>
-        <w:pStyle w:val="FootnoteText"/>
-      </w:pPr>
-      <w:r>
-        <w:rPr>
-          <w:rStyle w:val="FootnoteReference"/>
-        </w:rPr>
-        <w:footnoteRef/>
-      </w:r>
-      <w:r>
-        <w:t xml:space="preserve"> </w:t>
-      </w:r>
-      <w:r>
-        <w:t xml:space="preserve">Gilles Deleuze characterizes the relationship among the Kantian faculties as a discordant or contingent accord in </w:t>
-      </w:r>
-      <w:r>
-        <w:rPr>
-          <w:i/>
-          <w:iCs/>
-        </w:rPr>
-        <w:t xml:space="preserve">Kant’s Critical Philosophy</w:t>
-      </w:r>
-      <w:r>
-        <w:t xml:space="preserve">, translated by Hugh Tomlinson and Barbara Habberjam (Minneapolis: University of Minnesota Press, 1984), p.54.</w:t>
-      </w:r>
-    </w:p>
-  </w:footnote>
-  <w:footnote w:id="59">
-    <w:p>
-      <w:pPr>
-        <w:pStyle w:val="FootnoteText"/>
-      </w:pPr>
-      <w:r>
-        <w:rPr>
-          <w:rStyle w:val="FootnoteReference"/>
-        </w:rPr>
-        <w:footnoteRef/>
-      </w:r>
-      <w:r>
-        <w:t xml:space="preserve"> </w:t>
-      </w:r>
-      <w:r>
-        <w:t xml:space="preserve">On the relationship of imagination and reason in the mathematical sublime, see Immanuel Kant, </w:t>
-      </w:r>
-      <w:r>
-        <w:rPr>
-          <w:i/>
-          <w:iCs/>
-        </w:rPr>
-        <w:t xml:space="preserve">Critique of Judgment</w:t>
-      </w:r>
-      <w:r>
-        <w:t xml:space="preserve">, translated by Werner Pluhar (Indianapolis: Hackett Publishing Co., 1987), pp.109-116.</w:t>
-      </w:r>
-    </w:p>
-  </w:footnote>
-  <w:footnote w:id="60">
-    <w:p>
-      <w:pPr>
-        <w:pStyle w:val="FootnoteText"/>
-      </w:pPr>
-      <w:r>
-        <w:rPr>
-          <w:rStyle w:val="FootnoteReference"/>
-        </w:rPr>
-        <w:footnoteRef/>
-      </w:r>
-      <w:r>
-        <w:t xml:space="preserve"> </w:t>
-      </w:r>
-      <w:r>
-        <w:t xml:space="preserve">The main distinction between Zizek and Lacan here is the notion of finitude, because Lacan in </w:t>
-      </w:r>
-      <w:r>
-        <w:rPr>
-          <w:i/>
-          <w:iCs/>
-        </w:rPr>
-        <w:t xml:space="preserve">Seminar XX</w:t>
-      </w:r>
-      <w:r>
-        <w:t xml:space="preserve"> relates the</w:t>
-      </w:r>
-      <w:r>
-        <w:t xml:space="preserve"> </w:t>
-      </w:r>
-      <w:r>
-        <w:t xml:space="preserve">“not-all”</w:t>
-      </w:r>
-      <w:r>
-        <w:t xml:space="preserve"> </w:t>
-      </w:r>
-      <w:r>
-        <w:t xml:space="preserve">to an infinite set in order for it to not function as an exception (p.103). Lacan deals with classical Aristotelian logic, where any negation would have to constitute an exception, and it is on the other hand modern forms of</w:t>
-      </w:r>
-      <w:r>
-        <w:t xml:space="preserve"> </w:t>
-      </w:r>
-      <w:r>
-        <w:t xml:space="preserve">“infinite”</w:t>
-      </w:r>
-      <w:r>
-        <w:t xml:space="preserve"> </w:t>
-      </w:r>
-      <w:r>
-        <w:t xml:space="preserve">mathematics and logic that allow a thinking of negation or</w:t>
-      </w:r>
-      <w:r>
-        <w:t xml:space="preserve"> </w:t>
-      </w:r>
-      <w:r>
-        <w:t xml:space="preserve">“not-all”</w:t>
-      </w:r>
-      <w:r>
-        <w:t xml:space="preserve"> </w:t>
-      </w:r>
-      <w:r>
-        <w:t xml:space="preserve">which would not fall into a logic of exceptionality. Here I am following Zizek by relating Lacan’s distinction to a </w:t>
-      </w:r>
-      <w:r>
-        <w:rPr>
-          <w:i/>
-          <w:iCs/>
-        </w:rPr>
-        <w:t xml:space="preserve">philosophical</w:t>
-      </w:r>
-      <w:r>
-        <w:t xml:space="preserve"> understanding of finitude as opposed to a metaphysical infinite which could only function as an exception to worldly finitude understood as simply the realm of human experience.</w:t>
-      </w:r>
-    </w:p>
-  </w:footnote>
-  <w:footnote w:id="61">
     <w:p>
       <w:pPr>
         <w:pStyle w:val="FootnoteText"/>

</xml_diff>